<commit_message>
Label as v1.1.0-beta with not-widely-tested notes throughout
</commit_message>
<xml_diff>
--- a/GenBank_Protocol.docx
+++ b/GenBank_Protocol.docx
@@ -15,7 +15,7 @@
           <w:sz w:val="20"/>
           <w:szCs w:val="20"/>
         </w:rPr>
-        <w:t xml:space="preserve">Version 1.1 — August 3, 2026</w:t>
+        <w:t xml:space="preserve">Version 1.1 Beta — August 3, 2026</w:t>
       </w:r>
     </w:p>
     <w:p>
@@ -58,6 +58,30 @@
           <w:szCs w:val="20"/>
         </w:rPr>
         <w:t xml:space="preserve">github.com/FeatureConvert/TableTurner</w:t>
+      </w:r>
+    </w:p>
+    <w:p>
+      <w:pPr>
+        <w:spacing w:after="160"/>
+        <w:ind w:left="360"/>
+      </w:pPr>
+      <w:r>
+        <w:rPr>
+          <w:b/>
+          <w:bCs/>
+          <w:i/>
+          <w:iCs/>
+          <w:color w:val="555555"/>
+        </w:rPr>
+        <w:t xml:space="preserve">Note: </w:t>
+      </w:r>
+      <w:r>
+        <w:rPr>
+          <w:i/>
+          <w:iCs/>
+          <w:color w:val="555555"/>
+        </w:rPr>
+        <w:t xml:space="preserve">This is a beta release. It's been validated feature-by-feature and character-by-character against one real published genome (see section 5 and the examples/moonfish/ folder in the repo), but hasn't yet been run across multiple labs, users, or a wider range of genomes and annotation styles. Treat every output as something to verify, not something to trust blindly — see section 5, "Verifying the output," every time.</w:t>
       </w:r>
     </w:p>
     <w:p>
@@ -1504,6 +1528,19 @@
       </w:pPr>
       <w:r>
         <w:t xml:space="preserve">7. Known limitations (current version)</w:t>
+      </w:r>
+    </w:p>
+    <w:p>
+      <w:pPr>
+        <w:pStyle w:val="ListParagraph"/>
+        <w:numPr>
+          <w:ilvl w:val="0"/>
+          <w:numId w:val="1"/>
+        </w:numPr>
+        <w:spacing w:after="80"/>
+      </w:pPr>
+      <w:r>
+        <w:t xml:space="preserve">Beta software — not yet widely tested. Validated against one real published genome so far; hasn't been run across multiple labs, users, or a wider variety of genomes/annotation styles.</w:t>
       </w:r>
     </w:p>
     <w:p>

</xml_diff>